<commit_message>
ChangeLog updated for a typo correction.
The deprecated enumerator for eExam.24 is 3524007 instead of 3524005.
</commit_message>
<xml_diff>
--- a/DataDictionary/ChangeLog.docx
+++ b/DataDictionary/ChangeLog.docx
@@ -347,6 +347,27 @@
           <w:sz w:val="28"/>
         </w:rPr>
         <w:t>1</w:t>
+      </w:r>
+    </w:p>
+    <w:p>
+      <w:pPr>
+        <w:spacing w:after="3" w:line="259" w:lineRule="auto"/>
+        <w:ind w:left="-3" w:hanging="10"/>
+        <w:rPr>
+          <w:rFonts w:ascii="Cambria" w:eastAsia="Cambria" w:hAnsi="Cambria" w:cs="Cambria"/>
+          <w:b/>
+          <w:color w:val="365F91"/>
+          <w:sz w:val="28"/>
+        </w:rPr>
+      </w:pPr>
+      <w:r>
+        <w:rPr>
+          <w:rFonts w:ascii="Cambria" w:eastAsia="Cambria" w:hAnsi="Cambria" w:cs="Cambria"/>
+          <w:b/>
+          <w:color w:val="365F91"/>
+          <w:sz w:val="28"/>
+        </w:rPr>
+        <w:t>Updated August 2025 for typo correction</w:t>
       </w:r>
     </w:p>
     <w:p>
@@ -24572,7 +24593,19 @@
         <w:rPr>
           <w:bCs/>
         </w:rPr>
-        <w:t>Enumeration value: 3524005; Documentation: Right – Posterior</w:t>
+        <w:t>Enumeration value: 352400</w:t>
+      </w:r>
+      <w:r>
+        <w:rPr>
+          <w:bCs/>
+        </w:rPr>
+        <w:t>7</w:t>
+      </w:r>
+      <w:r>
+        <w:rPr>
+          <w:bCs/>
+        </w:rPr>
+        <w:t>; Documentation: Right – Posterior</w:t>
       </w:r>
     </w:p>
     <w:p>
@@ -24623,7 +24656,19 @@
         <w:rPr>
           <w:bCs/>
         </w:rPr>
-        <w:t>Enumeration value: 3524005; Documentation: Right – Posterior (DEPRECATED)</w:t>
+        <w:t>Enumeration value: 352400</w:t>
+      </w:r>
+      <w:r>
+        <w:rPr>
+          <w:bCs/>
+        </w:rPr>
+        <w:t>7</w:t>
+      </w:r>
+      <w:r>
+        <w:rPr>
+          <w:bCs/>
+        </w:rPr>
+        <w:t>; Documentation: Right – Posterior (DEPRECATED)</w:t>
       </w:r>
     </w:p>
     <w:p>

</xml_diff>